<commit_message>
Adicionado o .fig com o protótipo e foi inserido no documento de arquitetura os topicos que agregam a parte do protótipo
</commit_message>
<xml_diff>
--- a/Documento de Arquitetura.docx
+++ b/Documento de Arquitetura.docx
@@ -896,6 +896,15 @@
               </w:rPr>
               <w:t>FreeLance</w:t>
             </w:r>
+            <w:r>
+              <w:rPr>
+                <w:rFonts w:cs="Arial"/>
+                <w:sz w:val="18"/>
+                <w:szCs w:val="18"/>
+                <w:lang w:eastAsia="en-US"/>
+              </w:rPr>
+              <w:t>r</w:t>
+            </w:r>
             <w:proofErr w:type="spellEnd"/>
           </w:p>
         </w:tc>
@@ -1003,6 +1012,15 @@
                 <w:lang w:eastAsia="en-US"/>
               </w:rPr>
             </w:pPr>
+            <w:r>
+              <w:rPr>
+                <w:rFonts w:eastAsia="Arial Unicode MS" w:cs="Arial"/>
+                <w:sz w:val="18"/>
+                <w:szCs w:val="18"/>
+                <w:lang w:eastAsia="en-US"/>
+              </w:rPr>
+              <w:t>05/05/2026</w:t>
+            </w:r>
           </w:p>
         </w:tc>
         <w:tc>
@@ -1030,6 +1048,33 @@
                 <w:lang w:eastAsia="en-US"/>
               </w:rPr>
             </w:pPr>
+            <w:r>
+              <w:rPr>
+                <w:rFonts w:eastAsia="Arial Unicode MS" w:cs="Arial"/>
+                <w:sz w:val="18"/>
+                <w:szCs w:val="18"/>
+                <w:lang w:eastAsia="en-US"/>
+              </w:rPr>
+              <w:t>FLN-</w:t>
+            </w:r>
+            <w:r>
+              <w:rPr>
+                <w:rFonts w:cs="Arial"/>
+                <w:sz w:val="18"/>
+                <w:szCs w:val="18"/>
+                <w:lang w:eastAsia="en-US"/>
+              </w:rPr>
+              <w:t>00000</w:t>
+            </w:r>
+            <w:r>
+              <w:rPr>
+                <w:rFonts w:eastAsia="Arial Unicode MS" w:cs="Arial"/>
+                <w:sz w:val="18"/>
+                <w:szCs w:val="18"/>
+                <w:lang w:eastAsia="en-US"/>
+              </w:rPr>
+              <w:t>2</w:t>
+            </w:r>
           </w:p>
         </w:tc>
         <w:tc>
@@ -1056,6 +1101,26 @@
                 <w:lang w:eastAsia="en-US"/>
               </w:rPr>
             </w:pPr>
+            <w:r>
+              <w:rPr>
+                <w:rFonts w:eastAsia="Arial Unicode MS" w:cs="Arial"/>
+                <w:sz w:val="18"/>
+                <w:szCs w:val="18"/>
+                <w:lang w:eastAsia="en-US"/>
+              </w:rPr>
+              <w:t xml:space="preserve">Equipe </w:t>
+            </w:r>
+            <w:proofErr w:type="spellStart"/>
+            <w:r>
+              <w:rPr>
+                <w:rFonts w:eastAsia="Arial Unicode MS" w:cs="Arial"/>
+                <w:sz w:val="18"/>
+                <w:szCs w:val="18"/>
+                <w:lang w:eastAsia="en-US"/>
+              </w:rPr>
+              <w:t>FreeLancer</w:t>
+            </w:r>
+            <w:proofErr w:type="spellEnd"/>
           </w:p>
         </w:tc>
         <w:tc>
@@ -1083,6 +1148,15 @@
                 <w:lang w:eastAsia="en-US"/>
               </w:rPr>
             </w:pPr>
+            <w:r>
+              <w:rPr>
+                <w:rFonts w:eastAsia="Arial Unicode MS" w:cs="Arial"/>
+                <w:sz w:val="18"/>
+                <w:szCs w:val="18"/>
+                <w:lang w:eastAsia="en-US"/>
+              </w:rPr>
+              <w:t xml:space="preserve">Foi adicionado os campos de prototipação, com adesão das telas, fluxos de usuários e descrição de funcionalidades </w:t>
+            </w:r>
           </w:p>
         </w:tc>
         <w:tc>
@@ -1110,6 +1184,15 @@
                 <w:lang w:eastAsia="en-US"/>
               </w:rPr>
             </w:pPr>
+            <w:r>
+              <w:rPr>
+                <w:rFonts w:eastAsia="Arial Unicode MS" w:cs="Arial"/>
+                <w:sz w:val="18"/>
+                <w:szCs w:val="18"/>
+                <w:lang w:eastAsia="en-US"/>
+              </w:rPr>
+              <w:t>1.1</w:t>
+            </w:r>
           </w:p>
         </w:tc>
       </w:tr>
@@ -3837,60 +3920,60 @@
           <w:sz w:val="20"/>
           <w:szCs w:val="20"/>
         </w:rPr>
+        <w:t xml:space="preserve">2FA – </w:t>
+      </w:r>
+      <w:proofErr w:type="spellStart"/>
+      <w:r>
+        <w:rPr>
+          <w:rFonts w:ascii="Arial" w:hAnsi="Arial" w:cs="Arial"/>
+          <w:sz w:val="20"/>
+          <w:szCs w:val="20"/>
+        </w:rPr>
+        <w:t>Two</w:t>
+      </w:r>
+      <w:proofErr w:type="spellEnd"/>
+      <w:r>
+        <w:rPr>
+          <w:rFonts w:ascii="Arial" w:hAnsi="Arial" w:cs="Arial"/>
+          <w:sz w:val="20"/>
+          <w:szCs w:val="20"/>
+        </w:rPr>
+        <w:t xml:space="preserve">-Factor </w:t>
+      </w:r>
+      <w:proofErr w:type="spellStart"/>
+      <w:r>
+        <w:rPr>
+          <w:rFonts w:ascii="Arial" w:hAnsi="Arial" w:cs="Arial"/>
+          <w:sz w:val="20"/>
+          <w:szCs w:val="20"/>
+        </w:rPr>
+        <w:t>Authentication</w:t>
+      </w:r>
+      <w:proofErr w:type="spellEnd"/>
+      <w:r>
+        <w:rPr>
+          <w:rFonts w:ascii="Arial" w:hAnsi="Arial" w:cs="Arial"/>
+          <w:sz w:val="20"/>
+          <w:szCs w:val="20"/>
+        </w:rPr>
+        <w:t>, autenticação de dois fatores utilizada como camada adicional de segurança no login.</w:t>
+      </w:r>
+    </w:p>
+    <w:p>
+      <w:pPr>
+        <w:rPr>
+          <w:rFonts w:ascii="Arial" w:hAnsi="Arial" w:cs="Arial"/>
+          <w:sz w:val="20"/>
+          <w:szCs w:val="20"/>
+        </w:rPr>
+      </w:pPr>
+      <w:r>
+        <w:rPr>
+          <w:rFonts w:ascii="Arial" w:hAnsi="Arial" w:cs="Arial"/>
+          <w:sz w:val="20"/>
+          <w:szCs w:val="20"/>
+        </w:rPr>
         <w:lastRenderedPageBreak/>
-        <w:t xml:space="preserve">2FA – </w:t>
-      </w:r>
-      <w:proofErr w:type="spellStart"/>
-      <w:r>
-        <w:rPr>
-          <w:rFonts w:ascii="Arial" w:hAnsi="Arial" w:cs="Arial"/>
-          <w:sz w:val="20"/>
-          <w:szCs w:val="20"/>
-        </w:rPr>
-        <w:t>Two</w:t>
-      </w:r>
-      <w:proofErr w:type="spellEnd"/>
-      <w:r>
-        <w:rPr>
-          <w:rFonts w:ascii="Arial" w:hAnsi="Arial" w:cs="Arial"/>
-          <w:sz w:val="20"/>
-          <w:szCs w:val="20"/>
-        </w:rPr>
-        <w:t xml:space="preserve">-Factor </w:t>
-      </w:r>
-      <w:proofErr w:type="spellStart"/>
-      <w:r>
-        <w:rPr>
-          <w:rFonts w:ascii="Arial" w:hAnsi="Arial" w:cs="Arial"/>
-          <w:sz w:val="20"/>
-          <w:szCs w:val="20"/>
-        </w:rPr>
-        <w:t>Authentication</w:t>
-      </w:r>
-      <w:proofErr w:type="spellEnd"/>
-      <w:r>
-        <w:rPr>
-          <w:rFonts w:ascii="Arial" w:hAnsi="Arial" w:cs="Arial"/>
-          <w:sz w:val="20"/>
-          <w:szCs w:val="20"/>
-        </w:rPr>
-        <w:t>, autenticação de dois fatores utilizada como camada adicional de segurança no login.</w:t>
-      </w:r>
-    </w:p>
-    <w:p>
-      <w:pPr>
-        <w:rPr>
-          <w:rFonts w:ascii="Arial" w:hAnsi="Arial" w:cs="Arial"/>
-          <w:sz w:val="20"/>
-          <w:szCs w:val="20"/>
-        </w:rPr>
-      </w:pPr>
-      <w:r>
-        <w:rPr>
-          <w:rFonts w:ascii="Arial" w:hAnsi="Arial" w:cs="Arial"/>
-          <w:sz w:val="20"/>
-          <w:szCs w:val="20"/>
-        </w:rPr>
         <w:t>MDS – Metodologia de Desenvolvimento de Software, conjunto de práticas e artefatos adotados pela equipe.</w:t>
       </w:r>
     </w:p>
@@ -6211,7 +6294,6 @@
           <w:sz w:val="24"/>
           <w:szCs w:val="24"/>
         </w:rPr>
-        <w:lastRenderedPageBreak/>
         <w:t>VISÃO LÓGICA</w:t>
       </w:r>
       <w:bookmarkEnd w:id="29"/>
@@ -6257,7 +6339,16 @@
           <w:b w:val="0"/>
           <w:szCs w:val="20"/>
         </w:rPr>
-        <w:t>mais importantes, por exemplo, aspectos dinâmicos da arquitetura. Diagramas de classes e sequência devem ser incluídos para ilustrar os relacionamentos entre as classes significativas na arquitetura, subsistemas, pacotes e camadas.</w:t>
+        <w:t xml:space="preserve">mais importantes, por exemplo, aspectos </w:t>
+      </w:r>
+      <w:r>
+        <w:rPr>
+          <w:rFonts w:cs="Arial"/>
+          <w:b w:val="0"/>
+          <w:szCs w:val="20"/>
+        </w:rPr>
+        <w:lastRenderedPageBreak/>
+        <w:t>dinâmicos da arquitetura. Diagramas de classes e sequência devem ser incluídos para ilustrar os relacionamentos entre as classes significativas na arquitetura, subsistemas, pacotes e camadas.</w:t>
       </w:r>
     </w:p>
     <w:p>
@@ -8265,10 +8356,18 @@
           <w:sz w:val="24"/>
           <w:szCs w:val="24"/>
         </w:rPr>
-        <w:t>QUALIDADE</w:t>
+        <w:t>QUALIDAD</w:t>
       </w:r>
       <w:bookmarkEnd w:id="47"/>
       <w:bookmarkEnd w:id="48"/>
+      <w:r>
+        <w:rPr>
+          <w:rFonts w:ascii="Arial" w:hAnsi="Arial" w:cs="Arial"/>
+          <w:sz w:val="24"/>
+          <w:szCs w:val="24"/>
+        </w:rPr>
+        <w:t>E</w:t>
+      </w:r>
     </w:p>
     <w:p>
       <w:pPr>
@@ -8996,14 +9095,778 @@
     </w:p>
     <w:p>
       <w:pPr>
-        <w:spacing w:after="200" w:line="276" w:lineRule="auto"/>
-        <w:rPr>
-          <w:rFonts w:ascii="Arial" w:hAnsi="Arial" w:cs="Arial"/>
-          <w:sz w:val="20"/>
-          <w:szCs w:val="20"/>
-        </w:rPr>
-      </w:pPr>
-    </w:p>
+        <w:pStyle w:val="Ttulo1"/>
+        <w:shd w:val="clear" w:color="auto" w:fill="auto"/>
+        <w:rPr>
+          <w:rFonts w:ascii="Arial" w:hAnsi="Arial" w:cs="Arial"/>
+          <w:sz w:val="24"/>
+          <w:szCs w:val="24"/>
+        </w:rPr>
+      </w:pPr>
+      <w:r>
+        <w:rPr>
+          <w:rFonts w:ascii="Arial" w:hAnsi="Arial" w:cs="Arial"/>
+          <w:sz w:val="24"/>
+          <w:szCs w:val="24"/>
+        </w:rPr>
+        <w:t>PROTÓTIPO</w:t>
+      </w:r>
+    </w:p>
+    <w:p>
+      <w:pPr>
+        <w:pStyle w:val="Ttulo2"/>
+        <w:rPr>
+          <w:rFonts w:ascii="Arial" w:hAnsi="Arial" w:cs="Arial"/>
+          <w:sz w:val="20"/>
+          <w:szCs w:val="20"/>
+        </w:rPr>
+      </w:pPr>
+      <w:r>
+        <w:t xml:space="preserve">  </w:t>
+      </w:r>
+      <w:r>
+        <w:rPr>
+          <w:rFonts w:ascii="Arial" w:hAnsi="Arial" w:cs="Arial"/>
+          <w:sz w:val="20"/>
+          <w:szCs w:val="20"/>
+        </w:rPr>
+        <w:t>Principais telas do sistema</w:t>
+      </w:r>
+    </w:p>
+    <w:tbl>
+      <w:tblPr>
+        <w:tblStyle w:val="TabeladeGrade1Clara1"/>
+        <w:tblW w:w="0" w:type="auto"/>
+        <w:tblLook w:val="04A0" w:firstRow="1" w:lastRow="0" w:firstColumn="1" w:lastColumn="0" w:noHBand="0" w:noVBand="1"/>
+      </w:tblPr>
+      <w:tblGrid>
+        <w:gridCol w:w="4530"/>
+        <w:gridCol w:w="4531"/>
+      </w:tblGrid>
+      <w:tr>
+        <w:trPr>
+          <w:cnfStyle w:val="100000000000" w:firstRow="1" w:lastRow="0" w:firstColumn="0" w:lastColumn="0" w:oddVBand="0" w:evenVBand="0" w:oddHBand="0" w:evenHBand="0" w:firstRowFirstColumn="0" w:firstRowLastColumn="0" w:lastRowFirstColumn="0" w:lastRowLastColumn="0"/>
+        </w:trPr>
+        <w:tc>
+          <w:tcPr>
+            <w:cnfStyle w:val="001000000000" w:firstRow="0" w:lastRow="0" w:firstColumn="1" w:lastColumn="0" w:oddVBand="0" w:evenVBand="0" w:oddHBand="0" w:evenHBand="0" w:firstRowFirstColumn="0" w:firstRowLastColumn="0" w:lastRowFirstColumn="0" w:lastRowLastColumn="0"/>
+            <w:tcW w:w="4530" w:type="dxa"/>
+          </w:tcPr>
+          <w:p>
+            <w:pPr>
+              <w:jc w:val="center"/>
+              <w:rPr>
+                <w:rFonts w:ascii="Arial" w:hAnsi="Arial" w:cs="Arial"/>
+                <w:color w:val="000000" w:themeColor="text1"/>
+                <w:sz w:val="20"/>
+                <w:szCs w:val="20"/>
+              </w:rPr>
+            </w:pPr>
+            <w:r>
+              <w:rPr>
+                <w:rFonts w:ascii="Arial" w:hAnsi="Arial" w:cs="Arial"/>
+                <w:color w:val="000000" w:themeColor="text1"/>
+                <w:sz w:val="20"/>
+                <w:szCs w:val="20"/>
+              </w:rPr>
+              <w:t>Telas</w:t>
+            </w:r>
+          </w:p>
+        </w:tc>
+        <w:tc>
+          <w:tcPr>
+            <w:tcW w:w="4531" w:type="dxa"/>
+          </w:tcPr>
+          <w:p>
+            <w:pPr>
+              <w:jc w:val="center"/>
+              <w:cnfStyle w:val="100000000000" w:firstRow="1" w:lastRow="0" w:firstColumn="0" w:lastColumn="0" w:oddVBand="0" w:evenVBand="0" w:oddHBand="0" w:evenHBand="0" w:firstRowFirstColumn="0" w:firstRowLastColumn="0" w:lastRowFirstColumn="0" w:lastRowLastColumn="0"/>
+              <w:rPr>
+                <w:rFonts w:ascii="Arial" w:hAnsi="Arial" w:cs="Arial"/>
+                <w:sz w:val="20"/>
+                <w:szCs w:val="20"/>
+              </w:rPr>
+            </w:pPr>
+            <w:r>
+              <w:rPr>
+                <w:rFonts w:ascii="Arial" w:hAnsi="Arial" w:cs="Arial"/>
+                <w:sz w:val="20"/>
+                <w:szCs w:val="20"/>
+              </w:rPr>
+              <w:t>Função</w:t>
+            </w:r>
+          </w:p>
+        </w:tc>
+      </w:tr>
+      <w:tr>
+        <w:tc>
+          <w:tcPr>
+            <w:cnfStyle w:val="001000000000" w:firstRow="0" w:lastRow="0" w:firstColumn="1" w:lastColumn="0" w:oddVBand="0" w:evenVBand="0" w:oddHBand="0" w:evenHBand="0" w:firstRowFirstColumn="0" w:firstRowLastColumn="0" w:lastRowFirstColumn="0" w:lastRowLastColumn="0"/>
+            <w:tcW w:w="4530" w:type="dxa"/>
+          </w:tcPr>
+          <w:p>
+            <w:pPr>
+              <w:jc w:val="center"/>
+              <w:rPr>
+                <w:rFonts w:ascii="Arial" w:hAnsi="Arial" w:cs="Arial"/>
+                <w:b w:val="0"/>
+                <w:bCs w:val="0"/>
+                <w:sz w:val="20"/>
+                <w:szCs w:val="20"/>
+              </w:rPr>
+            </w:pPr>
+            <w:r>
+              <w:rPr>
+                <w:rFonts w:ascii="Arial" w:hAnsi="Arial" w:cs="Arial"/>
+                <w:b w:val="0"/>
+                <w:bCs w:val="0"/>
+                <w:sz w:val="20"/>
+                <w:szCs w:val="20"/>
+              </w:rPr>
+              <w:t>Busca de Serviços</w:t>
+            </w:r>
+          </w:p>
+        </w:tc>
+        <w:tc>
+          <w:tcPr>
+            <w:tcW w:w="4531" w:type="dxa"/>
+          </w:tcPr>
+          <w:p>
+            <w:pPr>
+              <w:cnfStyle w:val="000000000000" w:firstRow="0" w:lastRow="0" w:firstColumn="0" w:lastColumn="0" w:oddVBand="0" w:evenVBand="0" w:oddHBand="0" w:evenHBand="0" w:firstRowFirstColumn="0" w:firstRowLastColumn="0" w:lastRowFirstColumn="0" w:lastRowLastColumn="0"/>
+              <w:rPr>
+                <w:rFonts w:ascii="Arial" w:hAnsi="Arial" w:cs="Arial"/>
+                <w:sz w:val="20"/>
+                <w:szCs w:val="20"/>
+              </w:rPr>
+            </w:pPr>
+            <w:r>
+              <w:rPr>
+                <w:rFonts w:ascii="Arial" w:hAnsi="Arial" w:cs="Arial"/>
+                <w:sz w:val="20"/>
+                <w:szCs w:val="20"/>
+              </w:rPr>
+              <w:t>Permitir que empresas ou clientes explorem "pacotes de serviços" específicos previamente cadastrados pelos freelancers na plataforma.</w:t>
+            </w:r>
+          </w:p>
+        </w:tc>
+      </w:tr>
+      <w:tr>
+        <w:tc>
+          <w:tcPr>
+            <w:cnfStyle w:val="001000000000" w:firstRow="0" w:lastRow="0" w:firstColumn="1" w:lastColumn="0" w:oddVBand="0" w:evenVBand="0" w:oddHBand="0" w:evenHBand="0" w:firstRowFirstColumn="0" w:firstRowLastColumn="0" w:lastRowFirstColumn="0" w:lastRowLastColumn="0"/>
+            <w:tcW w:w="4530" w:type="dxa"/>
+          </w:tcPr>
+          <w:p>
+            <w:pPr>
+              <w:jc w:val="center"/>
+              <w:rPr>
+                <w:rFonts w:ascii="Arial" w:hAnsi="Arial" w:cs="Arial"/>
+                <w:b w:val="0"/>
+                <w:bCs w:val="0"/>
+                <w:sz w:val="20"/>
+                <w:szCs w:val="20"/>
+              </w:rPr>
+            </w:pPr>
+            <w:r>
+              <w:rPr>
+                <w:rFonts w:ascii="Arial" w:hAnsi="Arial" w:cs="Arial"/>
+                <w:b w:val="0"/>
+                <w:bCs w:val="0"/>
+                <w:sz w:val="20"/>
+                <w:szCs w:val="20"/>
+              </w:rPr>
+              <w:t>Perfil do Freelancer</w:t>
+            </w:r>
+          </w:p>
+        </w:tc>
+        <w:tc>
+          <w:tcPr>
+            <w:tcW w:w="4531" w:type="dxa"/>
+          </w:tcPr>
+          <w:p>
+            <w:pPr>
+              <w:cnfStyle w:val="000000000000" w:firstRow="0" w:lastRow="0" w:firstColumn="0" w:lastColumn="0" w:oddVBand="0" w:evenVBand="0" w:oddHBand="0" w:evenHBand="0" w:firstRowFirstColumn="0" w:firstRowLastColumn="0" w:lastRowFirstColumn="0" w:lastRowLastColumn="0"/>
+              <w:rPr>
+                <w:rFonts w:ascii="Arial" w:hAnsi="Arial" w:cs="Arial"/>
+                <w:sz w:val="20"/>
+                <w:szCs w:val="20"/>
+              </w:rPr>
+            </w:pPr>
+            <w:r>
+              <w:rPr>
+                <w:rFonts w:ascii="Arial" w:hAnsi="Arial" w:cs="Arial"/>
+                <w:sz w:val="20"/>
+                <w:szCs w:val="20"/>
+              </w:rPr>
+              <w:t>Atuar como o currículo detalhado e portfólio digital do profissional. É a página de conversão onde a empresa toma a decisão de enviar um convite de contratação.</w:t>
+            </w:r>
+          </w:p>
+        </w:tc>
+      </w:tr>
+      <w:tr>
+        <w:tc>
+          <w:tcPr>
+            <w:cnfStyle w:val="001000000000" w:firstRow="0" w:lastRow="0" w:firstColumn="1" w:lastColumn="0" w:oddVBand="0" w:evenVBand="0" w:oddHBand="0" w:evenHBand="0" w:firstRowFirstColumn="0" w:firstRowLastColumn="0" w:lastRowFirstColumn="0" w:lastRowLastColumn="0"/>
+            <w:tcW w:w="4530" w:type="dxa"/>
+          </w:tcPr>
+          <w:p>
+            <w:pPr>
+              <w:jc w:val="center"/>
+              <w:rPr>
+                <w:rFonts w:ascii="Arial" w:hAnsi="Arial" w:cs="Arial"/>
+                <w:b w:val="0"/>
+                <w:bCs w:val="0"/>
+                <w:sz w:val="20"/>
+                <w:szCs w:val="20"/>
+              </w:rPr>
+            </w:pPr>
+            <w:r>
+              <w:rPr>
+                <w:rFonts w:ascii="Arial" w:hAnsi="Arial" w:cs="Arial"/>
+                <w:b w:val="0"/>
+                <w:bCs w:val="0"/>
+                <w:sz w:val="20"/>
+                <w:szCs w:val="20"/>
+              </w:rPr>
+              <w:t>Perfil da Empresa</w:t>
+            </w:r>
+          </w:p>
+        </w:tc>
+        <w:tc>
+          <w:tcPr>
+            <w:tcW w:w="4531" w:type="dxa"/>
+          </w:tcPr>
+          <w:p>
+            <w:pPr>
+              <w:cnfStyle w:val="000000000000" w:firstRow="0" w:lastRow="0" w:firstColumn="0" w:lastColumn="0" w:oddVBand="0" w:evenVBand="0" w:oddHBand="0" w:evenHBand="0" w:firstRowFirstColumn="0" w:firstRowLastColumn="0" w:lastRowFirstColumn="0" w:lastRowLastColumn="0"/>
+              <w:rPr>
+                <w:rFonts w:ascii="Arial" w:hAnsi="Arial" w:cs="Arial"/>
+                <w:sz w:val="20"/>
+                <w:szCs w:val="20"/>
+              </w:rPr>
+            </w:pPr>
+            <w:r>
+              <w:rPr>
+                <w:rFonts w:ascii="Arial" w:hAnsi="Arial" w:cs="Arial"/>
+                <w:sz w:val="20"/>
+                <w:szCs w:val="20"/>
+              </w:rPr>
+              <w:t>Servir como uma página institucional pública para a empresa contratante. Seu objetivo é transmitir segurança e transparência para o freelancer que avalia uma proposta.</w:t>
+            </w:r>
+          </w:p>
+        </w:tc>
+      </w:tr>
+      <w:tr>
+        <w:tc>
+          <w:tcPr>
+            <w:cnfStyle w:val="001000000000" w:firstRow="0" w:lastRow="0" w:firstColumn="1" w:lastColumn="0" w:oddVBand="0" w:evenVBand="0" w:oddHBand="0" w:evenHBand="0" w:firstRowFirstColumn="0" w:firstRowLastColumn="0" w:lastRowFirstColumn="0" w:lastRowLastColumn="0"/>
+            <w:tcW w:w="4530" w:type="dxa"/>
+          </w:tcPr>
+          <w:p>
+            <w:pPr>
+              <w:jc w:val="center"/>
+              <w:rPr>
+                <w:rFonts w:ascii="Arial" w:hAnsi="Arial" w:cs="Arial"/>
+                <w:b w:val="0"/>
+                <w:bCs w:val="0"/>
+                <w:sz w:val="20"/>
+                <w:szCs w:val="20"/>
+              </w:rPr>
+            </w:pPr>
+            <w:r>
+              <w:rPr>
+                <w:rFonts w:ascii="Arial" w:hAnsi="Arial" w:cs="Arial"/>
+                <w:b w:val="0"/>
+                <w:bCs w:val="0"/>
+                <w:sz w:val="20"/>
+                <w:szCs w:val="20"/>
+              </w:rPr>
+              <w:t>Dashboard da Empresa</w:t>
+            </w:r>
+          </w:p>
+        </w:tc>
+        <w:tc>
+          <w:tcPr>
+            <w:tcW w:w="4531" w:type="dxa"/>
+          </w:tcPr>
+          <w:p>
+            <w:pPr>
+              <w:cnfStyle w:val="000000000000" w:firstRow="0" w:lastRow="0" w:firstColumn="0" w:lastColumn="0" w:oddVBand="0" w:evenVBand="0" w:oddHBand="0" w:evenHBand="0" w:firstRowFirstColumn="0" w:firstRowLastColumn="0" w:lastRowFirstColumn="0" w:lastRowLastColumn="0"/>
+              <w:rPr>
+                <w:rFonts w:ascii="Arial" w:hAnsi="Arial" w:cs="Arial"/>
+                <w:sz w:val="20"/>
+                <w:szCs w:val="20"/>
+              </w:rPr>
+            </w:pPr>
+            <w:r>
+              <w:rPr>
+                <w:rFonts w:ascii="Arial" w:hAnsi="Arial" w:cs="Arial"/>
+                <w:sz w:val="20"/>
+                <w:szCs w:val="20"/>
+              </w:rPr>
+              <w:t>Ser o centro de controle e painel gerencial do contratante logado no sistema.</w:t>
+            </w:r>
+          </w:p>
+        </w:tc>
+      </w:tr>
+      <w:tr>
+        <w:tc>
+          <w:tcPr>
+            <w:cnfStyle w:val="001000000000" w:firstRow="0" w:lastRow="0" w:firstColumn="1" w:lastColumn="0" w:oddVBand="0" w:evenVBand="0" w:oddHBand="0" w:evenHBand="0" w:firstRowFirstColumn="0" w:firstRowLastColumn="0" w:lastRowFirstColumn="0" w:lastRowLastColumn="0"/>
+            <w:tcW w:w="4530" w:type="dxa"/>
+          </w:tcPr>
+          <w:p>
+            <w:pPr>
+              <w:jc w:val="center"/>
+              <w:rPr>
+                <w:rFonts w:ascii="Arial" w:hAnsi="Arial" w:cs="Arial"/>
+                <w:b w:val="0"/>
+                <w:bCs w:val="0"/>
+                <w:sz w:val="20"/>
+                <w:szCs w:val="20"/>
+              </w:rPr>
+            </w:pPr>
+            <w:r>
+              <w:rPr>
+                <w:rFonts w:ascii="Arial" w:hAnsi="Arial" w:cs="Arial"/>
+                <w:b w:val="0"/>
+                <w:bCs w:val="0"/>
+                <w:sz w:val="20"/>
+                <w:szCs w:val="20"/>
+              </w:rPr>
+              <w:t>Meus Projetos</w:t>
+            </w:r>
+          </w:p>
+        </w:tc>
+        <w:tc>
+          <w:tcPr>
+            <w:tcW w:w="4531" w:type="dxa"/>
+          </w:tcPr>
+          <w:p>
+            <w:pPr>
+              <w:cnfStyle w:val="000000000000" w:firstRow="0" w:lastRow="0" w:firstColumn="0" w:lastColumn="0" w:oddVBand="0" w:evenVBand="0" w:oddHBand="0" w:evenHBand="0" w:firstRowFirstColumn="0" w:firstRowLastColumn="0" w:lastRowFirstColumn="0" w:lastRowLastColumn="0"/>
+              <w:rPr>
+                <w:rFonts w:ascii="Arial" w:hAnsi="Arial" w:cs="Arial"/>
+                <w:sz w:val="20"/>
+                <w:szCs w:val="20"/>
+              </w:rPr>
+            </w:pPr>
+            <w:r>
+              <w:rPr>
+                <w:rFonts w:ascii="Arial" w:hAnsi="Arial" w:cs="Arial"/>
+                <w:sz w:val="20"/>
+                <w:szCs w:val="20"/>
+              </w:rPr>
+              <w:t>Gerenciar o funil de contratação da empresa, organizando as demandas abertas, em andamento e já concluídas.</w:t>
+            </w:r>
+          </w:p>
+        </w:tc>
+      </w:tr>
+      <w:tr>
+        <w:tc>
+          <w:tcPr>
+            <w:cnfStyle w:val="001000000000" w:firstRow="0" w:lastRow="0" w:firstColumn="1" w:lastColumn="0" w:oddVBand="0" w:evenVBand="0" w:oddHBand="0" w:evenHBand="0" w:firstRowFirstColumn="0" w:firstRowLastColumn="0" w:lastRowFirstColumn="0" w:lastRowLastColumn="0"/>
+            <w:tcW w:w="4530" w:type="dxa"/>
+          </w:tcPr>
+          <w:p>
+            <w:pPr>
+              <w:jc w:val="center"/>
+              <w:rPr>
+                <w:rFonts w:ascii="Arial" w:hAnsi="Arial" w:cs="Arial"/>
+                <w:b w:val="0"/>
+                <w:bCs w:val="0"/>
+                <w:sz w:val="20"/>
+                <w:szCs w:val="20"/>
+              </w:rPr>
+            </w:pPr>
+            <w:r>
+              <w:rPr>
+                <w:rFonts w:ascii="Arial" w:hAnsi="Arial" w:cs="Arial"/>
+                <w:b w:val="0"/>
+                <w:bCs w:val="0"/>
+                <w:sz w:val="20"/>
+                <w:szCs w:val="20"/>
+              </w:rPr>
+              <w:t>Publicar Novo Projeto</w:t>
+            </w:r>
+          </w:p>
+        </w:tc>
+        <w:tc>
+          <w:tcPr>
+            <w:tcW w:w="4531" w:type="dxa"/>
+          </w:tcPr>
+          <w:p>
+            <w:pPr>
+              <w:cnfStyle w:val="000000000000" w:firstRow="0" w:lastRow="0" w:firstColumn="0" w:lastColumn="0" w:oddVBand="0" w:evenVBand="0" w:oddHBand="0" w:evenHBand="0" w:firstRowFirstColumn="0" w:firstRowLastColumn="0" w:lastRowFirstColumn="0" w:lastRowLastColumn="0"/>
+              <w:rPr>
+                <w:rFonts w:ascii="Arial" w:hAnsi="Arial" w:cs="Arial"/>
+                <w:sz w:val="20"/>
+                <w:szCs w:val="20"/>
+              </w:rPr>
+            </w:pPr>
+            <w:r>
+              <w:rPr>
+                <w:rFonts w:ascii="Arial" w:hAnsi="Arial" w:cs="Arial"/>
+                <w:sz w:val="20"/>
+                <w:szCs w:val="20"/>
+              </w:rPr>
+              <w:t>Interface estruturada de formulário para que a empresa crie e detalhe uma nova oportunidade de trabalho, tornando-a visível para os freelancers da plataforma.</w:t>
+            </w:r>
+          </w:p>
+        </w:tc>
+      </w:tr>
+      <w:tr>
+        <w:tc>
+          <w:tcPr>
+            <w:cnfStyle w:val="001000000000" w:firstRow="0" w:lastRow="0" w:firstColumn="1" w:lastColumn="0" w:oddVBand="0" w:evenVBand="0" w:oddHBand="0" w:evenHBand="0" w:firstRowFirstColumn="0" w:firstRowLastColumn="0" w:lastRowFirstColumn="0" w:lastRowLastColumn="0"/>
+            <w:tcW w:w="4530" w:type="dxa"/>
+          </w:tcPr>
+          <w:p>
+            <w:pPr>
+              <w:jc w:val="center"/>
+              <w:rPr>
+                <w:rFonts w:ascii="Arial" w:hAnsi="Arial" w:cs="Arial"/>
+                <w:b w:val="0"/>
+                <w:bCs w:val="0"/>
+                <w:sz w:val="20"/>
+                <w:szCs w:val="20"/>
+              </w:rPr>
+            </w:pPr>
+            <w:r>
+              <w:rPr>
+                <w:rFonts w:ascii="Arial" w:hAnsi="Arial" w:cs="Arial"/>
+                <w:b w:val="0"/>
+                <w:bCs w:val="0"/>
+                <w:sz w:val="20"/>
+                <w:szCs w:val="20"/>
+              </w:rPr>
+              <w:lastRenderedPageBreak/>
+              <w:t>Busca de Profissional</w:t>
+            </w:r>
+          </w:p>
+        </w:tc>
+        <w:tc>
+          <w:tcPr>
+            <w:tcW w:w="4531" w:type="dxa"/>
+          </w:tcPr>
+          <w:p>
+            <w:pPr>
+              <w:cnfStyle w:val="000000000000" w:firstRow="0" w:lastRow="0" w:firstColumn="0" w:lastColumn="0" w:oddVBand="0" w:evenVBand="0" w:oddHBand="0" w:evenHBand="0" w:firstRowFirstColumn="0" w:firstRowLastColumn="0" w:lastRowFirstColumn="0" w:lastRowLastColumn="0"/>
+              <w:rPr>
+                <w:rFonts w:ascii="Arial" w:hAnsi="Arial" w:cs="Arial"/>
+                <w:sz w:val="20"/>
+                <w:szCs w:val="20"/>
+              </w:rPr>
+            </w:pPr>
+            <w:r>
+              <w:rPr>
+                <w:rFonts w:ascii="Arial" w:hAnsi="Arial" w:cs="Arial"/>
+                <w:sz w:val="20"/>
+                <w:szCs w:val="20"/>
+              </w:rPr>
+              <w:t>Mecanismo de "</w:t>
+            </w:r>
+            <w:proofErr w:type="spellStart"/>
+            <w:r>
+              <w:rPr>
+                <w:rFonts w:ascii="Arial" w:hAnsi="Arial" w:cs="Arial"/>
+                <w:sz w:val="20"/>
+                <w:szCs w:val="20"/>
+              </w:rPr>
+              <w:t>Hunting</w:t>
+            </w:r>
+            <w:proofErr w:type="spellEnd"/>
+            <w:r>
+              <w:rPr>
+                <w:rFonts w:ascii="Arial" w:hAnsi="Arial" w:cs="Arial"/>
+                <w:sz w:val="20"/>
+                <w:szCs w:val="20"/>
+              </w:rPr>
+              <w:t>" (pesquisa ativa). Diferente da "Busca de Serviços" (onde se procura um produto fechado), aqui a empresa busca o perfil ideal de talento por meio de habilidades e características.</w:t>
+            </w:r>
+          </w:p>
+        </w:tc>
+      </w:tr>
+      <w:tr>
+        <w:tc>
+          <w:tcPr>
+            <w:cnfStyle w:val="001000000000" w:firstRow="0" w:lastRow="0" w:firstColumn="1" w:lastColumn="0" w:oddVBand="0" w:evenVBand="0" w:oddHBand="0" w:evenHBand="0" w:firstRowFirstColumn="0" w:firstRowLastColumn="0" w:lastRowFirstColumn="0" w:lastRowLastColumn="0"/>
+            <w:tcW w:w="4530" w:type="dxa"/>
+          </w:tcPr>
+          <w:p>
+            <w:pPr>
+              <w:jc w:val="center"/>
+              <w:rPr>
+                <w:rFonts w:ascii="Arial" w:hAnsi="Arial" w:cs="Arial"/>
+                <w:b w:val="0"/>
+                <w:bCs w:val="0"/>
+                <w:sz w:val="20"/>
+                <w:szCs w:val="20"/>
+              </w:rPr>
+            </w:pPr>
+            <w:r>
+              <w:rPr>
+                <w:rFonts w:ascii="Arial" w:hAnsi="Arial" w:cs="Arial"/>
+                <w:b w:val="0"/>
+                <w:bCs w:val="0"/>
+                <w:sz w:val="20"/>
+                <w:szCs w:val="20"/>
+              </w:rPr>
+              <w:t>Tela de Login</w:t>
+            </w:r>
+          </w:p>
+        </w:tc>
+        <w:tc>
+          <w:tcPr>
+            <w:tcW w:w="4531" w:type="dxa"/>
+          </w:tcPr>
+          <w:p>
+            <w:pPr>
+              <w:cnfStyle w:val="000000000000" w:firstRow="0" w:lastRow="0" w:firstColumn="0" w:lastColumn="0" w:oddVBand="0" w:evenVBand="0" w:oddHBand="0" w:evenHBand="0" w:firstRowFirstColumn="0" w:firstRowLastColumn="0" w:lastRowFirstColumn="0" w:lastRowLastColumn="0"/>
+              <w:rPr>
+                <w:rFonts w:ascii="Arial" w:hAnsi="Arial" w:cs="Arial"/>
+                <w:sz w:val="20"/>
+                <w:szCs w:val="20"/>
+              </w:rPr>
+            </w:pPr>
+            <w:r>
+              <w:rPr>
+                <w:rFonts w:ascii="Arial" w:hAnsi="Arial" w:cs="Arial"/>
+                <w:sz w:val="20"/>
+                <w:szCs w:val="20"/>
+              </w:rPr>
+              <w:t>Autenticar o usuário de forma segura e redirecioná-lo automaticamente para o painel correto (Dashboard da Empresa ou do Freelancer) com base no seu tipo de conta.</w:t>
+            </w:r>
+          </w:p>
+        </w:tc>
+      </w:tr>
+      <w:tr>
+        <w:tc>
+          <w:tcPr>
+            <w:cnfStyle w:val="001000000000" w:firstRow="0" w:lastRow="0" w:firstColumn="1" w:lastColumn="0" w:oddVBand="0" w:evenVBand="0" w:oddHBand="0" w:evenHBand="0" w:firstRowFirstColumn="0" w:firstRowLastColumn="0" w:lastRowFirstColumn="0" w:lastRowLastColumn="0"/>
+            <w:tcW w:w="4530" w:type="dxa"/>
+          </w:tcPr>
+          <w:p>
+            <w:pPr>
+              <w:jc w:val="center"/>
+              <w:rPr>
+                <w:rFonts w:ascii="Arial" w:hAnsi="Arial" w:cs="Arial"/>
+                <w:b w:val="0"/>
+                <w:bCs w:val="0"/>
+                <w:sz w:val="20"/>
+                <w:szCs w:val="20"/>
+              </w:rPr>
+            </w:pPr>
+            <w:r>
+              <w:rPr>
+                <w:rFonts w:ascii="Arial" w:hAnsi="Arial" w:cs="Arial"/>
+                <w:b w:val="0"/>
+                <w:bCs w:val="0"/>
+                <w:sz w:val="20"/>
+                <w:szCs w:val="20"/>
+              </w:rPr>
+              <w:t>Tela de Cadastro - Perfil Freelancer</w:t>
+            </w:r>
+          </w:p>
+        </w:tc>
+        <w:tc>
+          <w:tcPr>
+            <w:tcW w:w="4531" w:type="dxa"/>
+          </w:tcPr>
+          <w:p>
+            <w:pPr>
+              <w:cnfStyle w:val="000000000000" w:firstRow="0" w:lastRow="0" w:firstColumn="0" w:lastColumn="0" w:oddVBand="0" w:evenVBand="0" w:oddHBand="0" w:evenHBand="0" w:firstRowFirstColumn="0" w:firstRowLastColumn="0" w:lastRowFirstColumn="0" w:lastRowLastColumn="0"/>
+              <w:rPr>
+                <w:rFonts w:ascii="Arial" w:hAnsi="Arial" w:cs="Arial"/>
+                <w:sz w:val="20"/>
+                <w:szCs w:val="20"/>
+              </w:rPr>
+            </w:pPr>
+            <w:r>
+              <w:rPr>
+                <w:rFonts w:ascii="Arial" w:hAnsi="Arial" w:cs="Arial"/>
+                <w:sz w:val="20"/>
+                <w:szCs w:val="20"/>
+              </w:rPr>
+              <w:t>Coletar as informações vitais para criar a conta do profissional e prepará-lo para a exibição no catálogo da plataforma.</w:t>
+            </w:r>
+          </w:p>
+        </w:tc>
+      </w:tr>
+      <w:tr>
+        <w:tc>
+          <w:tcPr>
+            <w:cnfStyle w:val="001000000000" w:firstRow="0" w:lastRow="0" w:firstColumn="1" w:lastColumn="0" w:oddVBand="0" w:evenVBand="0" w:oddHBand="0" w:evenHBand="0" w:firstRowFirstColumn="0" w:firstRowLastColumn="0" w:lastRowFirstColumn="0" w:lastRowLastColumn="0"/>
+            <w:tcW w:w="4530" w:type="dxa"/>
+          </w:tcPr>
+          <w:p>
+            <w:pPr>
+              <w:jc w:val="center"/>
+              <w:rPr>
+                <w:rFonts w:ascii="Arial" w:hAnsi="Arial" w:cs="Arial"/>
+                <w:b w:val="0"/>
+                <w:bCs w:val="0"/>
+                <w:sz w:val="20"/>
+                <w:szCs w:val="20"/>
+              </w:rPr>
+            </w:pPr>
+            <w:r>
+              <w:rPr>
+                <w:rFonts w:ascii="Arial" w:hAnsi="Arial" w:cs="Arial"/>
+                <w:b w:val="0"/>
+                <w:bCs w:val="0"/>
+                <w:sz w:val="20"/>
+                <w:szCs w:val="20"/>
+              </w:rPr>
+              <w:t>Tela de Cadastro - Perfil Empresa/Cliente</w:t>
+            </w:r>
+          </w:p>
+        </w:tc>
+        <w:tc>
+          <w:tcPr>
+            <w:tcW w:w="4531" w:type="dxa"/>
+          </w:tcPr>
+          <w:p>
+            <w:pPr>
+              <w:cnfStyle w:val="000000000000" w:firstRow="0" w:lastRow="0" w:firstColumn="0" w:lastColumn="0" w:oddVBand="0" w:evenVBand="0" w:oddHBand="0" w:evenHBand="0" w:firstRowFirstColumn="0" w:firstRowLastColumn="0" w:lastRowFirstColumn="0" w:lastRowLastColumn="0"/>
+              <w:rPr>
+                <w:rFonts w:ascii="Arial" w:hAnsi="Arial" w:cs="Arial"/>
+                <w:sz w:val="20"/>
+                <w:szCs w:val="20"/>
+              </w:rPr>
+            </w:pPr>
+            <w:r>
+              <w:rPr>
+                <w:rFonts w:ascii="Arial" w:hAnsi="Arial" w:cs="Arial"/>
+                <w:sz w:val="20"/>
+                <w:szCs w:val="20"/>
+              </w:rPr>
+              <w:t>Registrar a empresa contratante de forma rápida para que ela possa publicar um projeto ou iniciar uma busca o mais rápido possível.</w:t>
+            </w:r>
+          </w:p>
+        </w:tc>
+      </w:tr>
+    </w:tbl>
+    <w:p/>
+    <w:p>
+      <w:pPr>
+        <w:pStyle w:val="Ttulo2"/>
+        <w:rPr>
+          <w:rFonts w:ascii="Arial" w:hAnsi="Arial" w:cs="Arial"/>
+          <w:sz w:val="20"/>
+          <w:szCs w:val="20"/>
+        </w:rPr>
+      </w:pPr>
+      <w:r>
+        <w:rPr>
+          <w:rFonts w:ascii="Arial" w:hAnsi="Arial" w:cs="Arial"/>
+          <w:sz w:val="20"/>
+          <w:szCs w:val="20"/>
+        </w:rPr>
+        <w:t>Fluxo de usuário</w:t>
+      </w:r>
+    </w:p>
+    <w:p>
+      <w:pPr>
+        <w:pStyle w:val="NormalWeb"/>
+        <w:numPr>
+          <w:ilvl w:val="0"/>
+          <w:numId w:val="20"/>
+        </w:numPr>
+        <w:spacing w:before="0" w:beforeAutospacing="0"/>
+        <w:rPr>
+          <w:rFonts w:ascii="Arial" w:hAnsi="Arial" w:cs="Arial"/>
+          <w:sz w:val="20"/>
+          <w:szCs w:val="20"/>
+        </w:rPr>
+      </w:pPr>
+      <w:r>
+        <w:rPr>
+          <w:rFonts w:ascii="Arial" w:hAnsi="Arial" w:cs="Arial"/>
+          <w:b/>
+          <w:bCs/>
+          <w:sz w:val="20"/>
+          <w:szCs w:val="20"/>
+        </w:rPr>
+        <w:t>Visitante</w:t>
+      </w:r>
+      <w:r>
+        <w:rPr>
+          <w:rFonts w:ascii="Arial" w:hAnsi="Arial" w:cs="Arial"/>
+          <w:sz w:val="20"/>
+          <w:szCs w:val="20"/>
+        </w:rPr>
+        <w:t xml:space="preserve"> acessa a plataforma -&gt; Escolhe "Cadastrar" ou "Entrar" -&gt; Preenche credenciais -&gt; Sistema redireciona com base no Tipo de Conta. </w:t>
+      </w:r>
+    </w:p>
+    <w:p>
+      <w:pPr>
+        <w:pStyle w:val="NormalWeb"/>
+        <w:numPr>
+          <w:ilvl w:val="0"/>
+          <w:numId w:val="20"/>
+        </w:numPr>
+        <w:spacing w:before="0" w:beforeAutospacing="0"/>
+        <w:rPr>
+          <w:rFonts w:ascii="Arial" w:hAnsi="Arial" w:cs="Arial"/>
+          <w:sz w:val="20"/>
+          <w:szCs w:val="20"/>
+        </w:rPr>
+      </w:pPr>
+      <w:r>
+        <w:rPr>
+          <w:rFonts w:ascii="Arial" w:hAnsi="Arial" w:cs="Arial"/>
+          <w:b/>
+          <w:bCs/>
+          <w:sz w:val="20"/>
+          <w:szCs w:val="20"/>
+        </w:rPr>
+        <w:t>Fluxo do Cliente:</w:t>
+      </w:r>
+      <w:r>
+        <w:rPr>
+          <w:rFonts w:ascii="Arial" w:hAnsi="Arial" w:cs="Arial"/>
+          <w:sz w:val="20"/>
+          <w:szCs w:val="20"/>
+        </w:rPr>
+        <w:t xml:space="preserve"> Acessa Home -&gt; Realiza Busca/Filtro -&gt; Visualiza Lista -&gt; Clica em um Serviço -&gt; Analisa Perfil -&gt; Clica em "Solicitar Serviço" -&gt; Preenche Dados -&gt; Envia Solicitação. Após conclusão -&gt; Recebe Notificação -&gt; Avalia o Serviço. </w:t>
+      </w:r>
+    </w:p>
+    <w:p>
+      <w:pPr>
+        <w:pStyle w:val="NormalWeb"/>
+        <w:numPr>
+          <w:ilvl w:val="0"/>
+          <w:numId w:val="20"/>
+        </w:numPr>
+        <w:spacing w:before="0" w:beforeAutospacing="0"/>
+        <w:rPr>
+          <w:rFonts w:ascii="Arial" w:hAnsi="Arial" w:cs="Arial"/>
+          <w:sz w:val="20"/>
+          <w:szCs w:val="20"/>
+        </w:rPr>
+      </w:pPr>
+      <w:r>
+        <w:rPr>
+          <w:rFonts w:ascii="Arial" w:hAnsi="Arial" w:cs="Arial"/>
+          <w:b/>
+          <w:bCs/>
+          <w:sz w:val="20"/>
+          <w:szCs w:val="20"/>
+        </w:rPr>
+        <w:t>Fluxo do Freelancer:</w:t>
+      </w:r>
+      <w:r>
+        <w:rPr>
+          <w:rFonts w:ascii="Arial" w:hAnsi="Arial" w:cs="Arial"/>
+          <w:sz w:val="20"/>
+          <w:szCs w:val="20"/>
+        </w:rPr>
+        <w:t xml:space="preserve"> Acessa Dashboard -&gt; Clica em "Adicionar Serviço" -&gt; Preenche Formulário e Fotos -&gt; Publica. Recebe notificação de solicitação -&gt; Aceita ou Recusa (em até 48h). </w:t>
+      </w:r>
+    </w:p>
+    <w:p/>
     <w:sectPr>
       <w:headerReference w:type="default" r:id="rId19"/>
       <w:footerReference w:type="default" r:id="rId20"/>
@@ -9520,16 +10383,16 @@
 <file path=word/numbering.xml><?xml version="1.0" encoding="utf-8"?>
 <w:numbering xmlns:wpc="http://schemas.microsoft.com/office/word/2010/wordprocessingCanvas" xmlns:cx="http://schemas.microsoft.com/office/drawing/2014/chartex" xmlns:cx1="http://schemas.microsoft.com/office/drawing/2015/9/8/chartex" xmlns:cx2="http://schemas.microsoft.com/office/drawing/2015/10/21/chartex" xmlns:cx3="http://schemas.microsoft.com/office/drawing/2016/5/9/chartex" xmlns:cx4="http://schemas.microsoft.com/office/drawing/2016/5/10/chartex" xmlns:cx5="http://schemas.microsoft.com/office/drawing/2016/5/11/chartex" xmlns:cx6="http://schemas.microsoft.com/office/drawing/2016/5/12/chartex" xmlns:cx7="http://schemas.microsoft.com/office/drawing/2016/5/13/chartex" xmlns:cx8="http://schemas.microsoft.com/office/drawing/2016/5/14/chartex" xmlns:mc="http://schemas.openxmlformats.org/markup-compatibility/2006" xmlns:aink="http://schemas.microsoft.com/office/drawing/2016/ink" xmlns:am3d="http://schemas.microsoft.com/office/drawing/2017/model3d" xmlns:o="urn:schemas-microsoft-com:office:office" xmlns:oel="http://schemas.microsoft.com/office/2019/extlst" xmlns:r="http://schemas.openxmlformats.org/officeDocument/2006/relationships" xmlns:m="http://schemas.openxmlformats.org/officeDocument/2006/math" xmlns:v="urn:schemas-microsoft-com:vml" xmlns:wp14="http://schemas.microsoft.com/office/word/2010/wordprocessingDrawing" xmlns:wp="http://schemas.openxmlformats.org/drawingml/2006/wordprocessingDrawing" xmlns:w10="urn:schemas-microsoft-com:office:word" xmlns:w="http://schemas.openxmlformats.org/wordprocessingml/2006/main" xmlns:w14="http://schemas.microsoft.com/office/word/2010/wordml" xmlns:w15="http://schemas.microsoft.com/office/word/2012/wordml" xmlns:w16cex="http://schemas.microsoft.com/office/word/2018/wordml/cex" xmlns:w16cid="http://schemas.microsoft.com/office/word/2016/wordml/cid" xmlns:w16="http://schemas.microsoft.com/office/word/2018/wordml" xmlns:w16sdtdh="http://schemas.microsoft.com/office/word/2020/wordml/sdtdatahash" xmlns:w16se="http://schemas.microsoft.com/office/word/2015/wordml/symex" xmlns:wpg="http://schemas.microsoft.com/office/word/2010/wordprocessingGroup" xmlns:wpi="http://schemas.microsoft.com/office/word/2010/wordprocessingInk" xmlns:wne="http://schemas.microsoft.com/office/word/2006/wordml" xmlns:wps="http://schemas.microsoft.com/office/word/2010/wordprocessingShape" mc:Ignorable="w14 w15 w16se w16cid w16 w16cex w16sdtdh wp14">
   <w:abstractNum w:abstractNumId="0" w15:restartNumberingAfterBreak="0">
-    <w:nsid w:val="0A8361F8"/>
+    <w:nsid w:val="05122B75"/>
     <w:multiLevelType w:val="hybridMultilevel"/>
-    <w:tmpl w:val="6CBCD544"/>
+    <w:tmpl w:val="BCE8B402"/>
     <w:lvl w:ilvl="0" w:tplc="04160001">
       <w:start w:val="1"/>
       <w:numFmt w:val="bullet"/>
       <w:lvlText w:val=""/>
       <w:lvlJc w:val="left"/>
       <w:pPr>
-        <w:ind w:left="1152" w:hanging="360"/>
+        <w:ind w:left="720" w:hanging="360"/>
       </w:pPr>
       <w:rPr>
         <w:rFonts w:ascii="Symbol" w:hAnsi="Symbol" w:hint="default"/>
@@ -9541,7 +10404,7 @@
       <w:lvlText w:val="o"/>
       <w:lvlJc w:val="left"/>
       <w:pPr>
-        <w:ind w:left="1872" w:hanging="360"/>
+        <w:ind w:left="1440" w:hanging="360"/>
       </w:pPr>
       <w:rPr>
         <w:rFonts w:ascii="Courier New" w:hAnsi="Courier New" w:cs="Courier New" w:hint="default"/>
@@ -9553,7 +10416,7 @@
       <w:lvlText w:val=""/>
       <w:lvlJc w:val="left"/>
       <w:pPr>
-        <w:ind w:left="2592" w:hanging="360"/>
+        <w:ind w:left="2160" w:hanging="360"/>
       </w:pPr>
       <w:rPr>
         <w:rFonts w:ascii="Wingdings" w:hAnsi="Wingdings" w:hint="default"/>
@@ -9565,7 +10428,7 @@
       <w:lvlText w:val=""/>
       <w:lvlJc w:val="left"/>
       <w:pPr>
-        <w:ind w:left="3312" w:hanging="360"/>
+        <w:ind w:left="2880" w:hanging="360"/>
       </w:pPr>
       <w:rPr>
         <w:rFonts w:ascii="Symbol" w:hAnsi="Symbol" w:hint="default"/>
@@ -9577,7 +10440,7 @@
       <w:lvlText w:val="o"/>
       <w:lvlJc w:val="left"/>
       <w:pPr>
-        <w:ind w:left="4032" w:hanging="360"/>
+        <w:ind w:left="3600" w:hanging="360"/>
       </w:pPr>
       <w:rPr>
         <w:rFonts w:ascii="Courier New" w:hAnsi="Courier New" w:cs="Courier New" w:hint="default"/>
@@ -9589,7 +10452,7 @@
       <w:lvlText w:val=""/>
       <w:lvlJc w:val="left"/>
       <w:pPr>
-        <w:ind w:left="4752" w:hanging="360"/>
+        <w:ind w:left="4320" w:hanging="360"/>
       </w:pPr>
       <w:rPr>
         <w:rFonts w:ascii="Wingdings" w:hAnsi="Wingdings" w:hint="default"/>
@@ -9601,7 +10464,7 @@
       <w:lvlText w:val=""/>
       <w:lvlJc w:val="left"/>
       <w:pPr>
-        <w:ind w:left="5472" w:hanging="360"/>
+        <w:ind w:left="5040" w:hanging="360"/>
       </w:pPr>
       <w:rPr>
         <w:rFonts w:ascii="Symbol" w:hAnsi="Symbol" w:hint="default"/>
@@ -9613,7 +10476,7 @@
       <w:lvlText w:val="o"/>
       <w:lvlJc w:val="left"/>
       <w:pPr>
-        <w:ind w:left="6192" w:hanging="360"/>
+        <w:ind w:left="5760" w:hanging="360"/>
       </w:pPr>
       <w:rPr>
         <w:rFonts w:ascii="Courier New" w:hAnsi="Courier New" w:cs="Courier New" w:hint="default"/>
@@ -9625,7 +10488,7 @@
       <w:lvlText w:val=""/>
       <w:lvlJc w:val="left"/>
       <w:pPr>
-        <w:ind w:left="6912" w:hanging="360"/>
+        <w:ind w:left="6480" w:hanging="360"/>
       </w:pPr>
       <w:rPr>
         <w:rFonts w:ascii="Wingdings" w:hAnsi="Wingdings" w:hint="default"/>
@@ -9633,6 +10496,119 @@
     </w:lvl>
   </w:abstractNum>
   <w:abstractNum w:abstractNumId="1" w15:restartNumberingAfterBreak="0">
+    <w:nsid w:val="0A8361F8"/>
+    <w:multiLevelType w:val="hybridMultilevel"/>
+    <w:tmpl w:val="6CBCD544"/>
+    <w:lvl w:ilvl="0" w:tplc="04160001">
+      <w:start w:val="1"/>
+      <w:numFmt w:val="bullet"/>
+      <w:lvlText w:val=""/>
+      <w:lvlJc w:val="left"/>
+      <w:pPr>
+        <w:ind w:left="1152" w:hanging="360"/>
+      </w:pPr>
+      <w:rPr>
+        <w:rFonts w:ascii="Symbol" w:hAnsi="Symbol" w:hint="default"/>
+      </w:rPr>
+    </w:lvl>
+    <w:lvl w:ilvl="1" w:tplc="04160003" w:tentative="1">
+      <w:start w:val="1"/>
+      <w:numFmt w:val="bullet"/>
+      <w:lvlText w:val="o"/>
+      <w:lvlJc w:val="left"/>
+      <w:pPr>
+        <w:ind w:left="1872" w:hanging="360"/>
+      </w:pPr>
+      <w:rPr>
+        <w:rFonts w:ascii="Courier New" w:hAnsi="Courier New" w:cs="Courier New" w:hint="default"/>
+      </w:rPr>
+    </w:lvl>
+    <w:lvl w:ilvl="2" w:tplc="04160005" w:tentative="1">
+      <w:start w:val="1"/>
+      <w:numFmt w:val="bullet"/>
+      <w:lvlText w:val=""/>
+      <w:lvlJc w:val="left"/>
+      <w:pPr>
+        <w:ind w:left="2592" w:hanging="360"/>
+      </w:pPr>
+      <w:rPr>
+        <w:rFonts w:ascii="Wingdings" w:hAnsi="Wingdings" w:hint="default"/>
+      </w:rPr>
+    </w:lvl>
+    <w:lvl w:ilvl="3" w:tplc="04160001" w:tentative="1">
+      <w:start w:val="1"/>
+      <w:numFmt w:val="bullet"/>
+      <w:lvlText w:val=""/>
+      <w:lvlJc w:val="left"/>
+      <w:pPr>
+        <w:ind w:left="3312" w:hanging="360"/>
+      </w:pPr>
+      <w:rPr>
+        <w:rFonts w:ascii="Symbol" w:hAnsi="Symbol" w:hint="default"/>
+      </w:rPr>
+    </w:lvl>
+    <w:lvl w:ilvl="4" w:tplc="04160003" w:tentative="1">
+      <w:start w:val="1"/>
+      <w:numFmt w:val="bullet"/>
+      <w:lvlText w:val="o"/>
+      <w:lvlJc w:val="left"/>
+      <w:pPr>
+        <w:ind w:left="4032" w:hanging="360"/>
+      </w:pPr>
+      <w:rPr>
+        <w:rFonts w:ascii="Courier New" w:hAnsi="Courier New" w:cs="Courier New" w:hint="default"/>
+      </w:rPr>
+    </w:lvl>
+    <w:lvl w:ilvl="5" w:tplc="04160005" w:tentative="1">
+      <w:start w:val="1"/>
+      <w:numFmt w:val="bullet"/>
+      <w:lvlText w:val=""/>
+      <w:lvlJc w:val="left"/>
+      <w:pPr>
+        <w:ind w:left="4752" w:hanging="360"/>
+      </w:pPr>
+      <w:rPr>
+        <w:rFonts w:ascii="Wingdings" w:hAnsi="Wingdings" w:hint="default"/>
+      </w:rPr>
+    </w:lvl>
+    <w:lvl w:ilvl="6" w:tplc="04160001" w:tentative="1">
+      <w:start w:val="1"/>
+      <w:numFmt w:val="bullet"/>
+      <w:lvlText w:val=""/>
+      <w:lvlJc w:val="left"/>
+      <w:pPr>
+        <w:ind w:left="5472" w:hanging="360"/>
+      </w:pPr>
+      <w:rPr>
+        <w:rFonts w:ascii="Symbol" w:hAnsi="Symbol" w:hint="default"/>
+      </w:rPr>
+    </w:lvl>
+    <w:lvl w:ilvl="7" w:tplc="04160003" w:tentative="1">
+      <w:start w:val="1"/>
+      <w:numFmt w:val="bullet"/>
+      <w:lvlText w:val="o"/>
+      <w:lvlJc w:val="left"/>
+      <w:pPr>
+        <w:ind w:left="6192" w:hanging="360"/>
+      </w:pPr>
+      <w:rPr>
+        <w:rFonts w:ascii="Courier New" w:hAnsi="Courier New" w:cs="Courier New" w:hint="default"/>
+      </w:rPr>
+    </w:lvl>
+    <w:lvl w:ilvl="8" w:tplc="04160005" w:tentative="1">
+      <w:start w:val="1"/>
+      <w:numFmt w:val="bullet"/>
+      <w:lvlText w:val=""/>
+      <w:lvlJc w:val="left"/>
+      <w:pPr>
+        <w:ind w:left="6912" w:hanging="360"/>
+      </w:pPr>
+      <w:rPr>
+        <w:rFonts w:ascii="Wingdings" w:hAnsi="Wingdings" w:hint="default"/>
+      </w:rPr>
+    </w:lvl>
+  </w:abstractNum>
+  <w:abstractNum w:abstractNumId="2" w15:restartNumberingAfterBreak="0">
     <w:nsid w:val="1367000C"/>
     <w:multiLevelType w:val="multilevel"/>
     <w:tmpl w:val="0246A156"/>
@@ -9789,7 +10765,7 @@
       </w:rPr>
     </w:lvl>
   </w:abstractNum>
-  <w:abstractNum w:abstractNumId="2" w15:restartNumberingAfterBreak="0">
+  <w:abstractNum w:abstractNumId="3" w15:restartNumberingAfterBreak="0">
     <w:nsid w:val="1482775B"/>
     <w:multiLevelType w:val="multilevel"/>
     <w:tmpl w:val="0EBA3C40"/>
@@ -9875,7 +10851,7 @@
       </w:pPr>
     </w:lvl>
   </w:abstractNum>
-  <w:abstractNum w:abstractNumId="3" w15:restartNumberingAfterBreak="0">
+  <w:abstractNum w:abstractNumId="4" w15:restartNumberingAfterBreak="0">
     <w:nsid w:val="29BB2287"/>
     <w:multiLevelType w:val="hybridMultilevel"/>
     <w:tmpl w:val="26642256"/>
@@ -9988,7 +10964,7 @@
       </w:rPr>
     </w:lvl>
   </w:abstractNum>
-  <w:abstractNum w:abstractNumId="4" w15:restartNumberingAfterBreak="0">
+  <w:abstractNum w:abstractNumId="5" w15:restartNumberingAfterBreak="0">
     <w:nsid w:val="2B994A9C"/>
     <w:multiLevelType w:val="hybridMultilevel"/>
     <w:tmpl w:val="A860E6D2"/>
@@ -10101,7 +11077,120 @@
       </w:rPr>
     </w:lvl>
   </w:abstractNum>
-  <w:abstractNum w:abstractNumId="5" w15:restartNumberingAfterBreak="0">
+  <w:abstractNum w:abstractNumId="6" w15:restartNumberingAfterBreak="0">
+    <w:nsid w:val="411F0338"/>
+    <w:multiLevelType w:val="hybridMultilevel"/>
+    <w:tmpl w:val="360274F8"/>
+    <w:lvl w:ilvl="0" w:tplc="04160001">
+      <w:start w:val="1"/>
+      <w:numFmt w:val="bullet"/>
+      <w:lvlText w:val=""/>
+      <w:lvlJc w:val="left"/>
+      <w:pPr>
+        <w:ind w:left="720" w:hanging="360"/>
+      </w:pPr>
+      <w:rPr>
+        <w:rFonts w:ascii="Symbol" w:hAnsi="Symbol" w:hint="default"/>
+      </w:rPr>
+    </w:lvl>
+    <w:lvl w:ilvl="1" w:tplc="04160003" w:tentative="1">
+      <w:start w:val="1"/>
+      <w:numFmt w:val="bullet"/>
+      <w:lvlText w:val="o"/>
+      <w:lvlJc w:val="left"/>
+      <w:pPr>
+        <w:ind w:left="1440" w:hanging="360"/>
+      </w:pPr>
+      <w:rPr>
+        <w:rFonts w:ascii="Courier New" w:hAnsi="Courier New" w:cs="Courier New" w:hint="default"/>
+      </w:rPr>
+    </w:lvl>
+    <w:lvl w:ilvl="2" w:tplc="04160005" w:tentative="1">
+      <w:start w:val="1"/>
+      <w:numFmt w:val="bullet"/>
+      <w:lvlText w:val=""/>
+      <w:lvlJc w:val="left"/>
+      <w:pPr>
+        <w:ind w:left="2160" w:hanging="360"/>
+      </w:pPr>
+      <w:rPr>
+        <w:rFonts w:ascii="Wingdings" w:hAnsi="Wingdings" w:hint="default"/>
+      </w:rPr>
+    </w:lvl>
+    <w:lvl w:ilvl="3" w:tplc="04160001" w:tentative="1">
+      <w:start w:val="1"/>
+      <w:numFmt w:val="bullet"/>
+      <w:lvlText w:val=""/>
+      <w:lvlJc w:val="left"/>
+      <w:pPr>
+        <w:ind w:left="2880" w:hanging="360"/>
+      </w:pPr>
+      <w:rPr>
+        <w:rFonts w:ascii="Symbol" w:hAnsi="Symbol" w:hint="default"/>
+      </w:rPr>
+    </w:lvl>
+    <w:lvl w:ilvl="4" w:tplc="04160003" w:tentative="1">
+      <w:start w:val="1"/>
+      <w:numFmt w:val="bullet"/>
+      <w:lvlText w:val="o"/>
+      <w:lvlJc w:val="left"/>
+      <w:pPr>
+        <w:ind w:left="3600" w:hanging="360"/>
+      </w:pPr>
+      <w:rPr>
+        <w:rFonts w:ascii="Courier New" w:hAnsi="Courier New" w:cs="Courier New" w:hint="default"/>
+      </w:rPr>
+    </w:lvl>
+    <w:lvl w:ilvl="5" w:tplc="04160005" w:tentative="1">
+      <w:start w:val="1"/>
+      <w:numFmt w:val="bullet"/>
+      <w:lvlText w:val=""/>
+      <w:lvlJc w:val="left"/>
+      <w:pPr>
+        <w:ind w:left="4320" w:hanging="360"/>
+      </w:pPr>
+      <w:rPr>
+        <w:rFonts w:ascii="Wingdings" w:hAnsi="Wingdings" w:hint="default"/>
+      </w:rPr>
+    </w:lvl>
+    <w:lvl w:ilvl="6" w:tplc="04160001" w:tentative="1">
+      <w:start w:val="1"/>
+      <w:numFmt w:val="bullet"/>
+      <w:lvlText w:val=""/>
+      <w:lvlJc w:val="left"/>
+      <w:pPr>
+        <w:ind w:left="5040" w:hanging="360"/>
+      </w:pPr>
+      <w:rPr>
+        <w:rFonts w:ascii="Symbol" w:hAnsi="Symbol" w:hint="default"/>
+      </w:rPr>
+    </w:lvl>
+    <w:lvl w:ilvl="7" w:tplc="04160003" w:tentative="1">
+      <w:start w:val="1"/>
+      <w:numFmt w:val="bullet"/>
+      <w:lvlText w:val="o"/>
+      <w:lvlJc w:val="left"/>
+      <w:pPr>
+        <w:ind w:left="5760" w:hanging="360"/>
+      </w:pPr>
+      <w:rPr>
+        <w:rFonts w:ascii="Courier New" w:hAnsi="Courier New" w:cs="Courier New" w:hint="default"/>
+      </w:rPr>
+    </w:lvl>
+    <w:lvl w:ilvl="8" w:tplc="04160005" w:tentative="1">
+      <w:start w:val="1"/>
+      <w:numFmt w:val="bullet"/>
+      <w:lvlText w:val=""/>
+      <w:lvlJc w:val="left"/>
+      <w:pPr>
+        <w:ind w:left="6480" w:hanging="360"/>
+      </w:pPr>
+      <w:rPr>
+        <w:rFonts w:ascii="Wingdings" w:hAnsi="Wingdings" w:hint="default"/>
+      </w:rPr>
+    </w:lvl>
+  </w:abstractNum>
+  <w:abstractNum w:abstractNumId="7" w15:restartNumberingAfterBreak="0">
     <w:nsid w:val="4813347F"/>
     <w:multiLevelType w:val="multilevel"/>
     <w:tmpl w:val="7B6EC3CC"/>
@@ -10251,7 +11340,7 @@
       </w:rPr>
     </w:lvl>
   </w:abstractNum>
-  <w:abstractNum w:abstractNumId="6" w15:restartNumberingAfterBreak="0">
+  <w:abstractNum w:abstractNumId="8" w15:restartNumberingAfterBreak="0">
     <w:nsid w:val="6409737E"/>
     <w:multiLevelType w:val="multilevel"/>
     <w:tmpl w:val="E4D420EE"/>
@@ -10366,7 +11455,7 @@
       </w:pPr>
     </w:lvl>
   </w:abstractNum>
-  <w:abstractNum w:abstractNumId="7" w15:restartNumberingAfterBreak="0">
+  <w:abstractNum w:abstractNumId="9" w15:restartNumberingAfterBreak="0">
     <w:nsid w:val="7E20768D"/>
     <w:multiLevelType w:val="hybridMultilevel"/>
     <w:tmpl w:val="8FF6428E"/>
@@ -10421,64 +11510,70 @@
     </w:lvl>
   </w:abstractNum>
   <w:num w:numId="1" w16cid:durableId="962999660">
-    <w:abstractNumId w:val="1"/>
+    <w:abstractNumId w:val="2"/>
   </w:num>
   <w:num w:numId="2" w16cid:durableId="368844773">
-    <w:abstractNumId w:val="6"/>
+    <w:abstractNumId w:val="8"/>
   </w:num>
   <w:num w:numId="3" w16cid:durableId="333386045">
-    <w:abstractNumId w:val="2"/>
+    <w:abstractNumId w:val="3"/>
   </w:num>
   <w:num w:numId="4" w16cid:durableId="1718579308">
-    <w:abstractNumId w:val="2"/>
+    <w:abstractNumId w:val="3"/>
     <w:lvlOverride w:ilvl="0">
       <w:startOverride w:val="3"/>
     </w:lvlOverride>
   </w:num>
   <w:num w:numId="5" w16cid:durableId="1621455579">
+    <w:abstractNumId w:val="7"/>
+  </w:num>
+  <w:num w:numId="6" w16cid:durableId="253785016">
     <w:abstractNumId w:val="5"/>
   </w:num>
-  <w:num w:numId="6" w16cid:durableId="253785016">
+  <w:num w:numId="7" w16cid:durableId="282466554">
     <w:abstractNumId w:val="4"/>
   </w:num>
-  <w:num w:numId="7" w16cid:durableId="282466554">
-    <w:abstractNumId w:val="3"/>
-  </w:num>
   <w:num w:numId="8" w16cid:durableId="1126004197">
-    <w:abstractNumId w:val="0"/>
+    <w:abstractNumId w:val="1"/>
   </w:num>
   <w:num w:numId="9" w16cid:durableId="174542198">
-    <w:abstractNumId w:val="1"/>
+    <w:abstractNumId w:val="2"/>
   </w:num>
   <w:num w:numId="10" w16cid:durableId="1169559551">
-    <w:abstractNumId w:val="1"/>
+    <w:abstractNumId w:val="2"/>
   </w:num>
   <w:num w:numId="11" w16cid:durableId="1288972027">
-    <w:abstractNumId w:val="1"/>
+    <w:abstractNumId w:val="2"/>
   </w:num>
   <w:num w:numId="12" w16cid:durableId="5908377">
-    <w:abstractNumId w:val="1"/>
+    <w:abstractNumId w:val="2"/>
   </w:num>
   <w:num w:numId="13" w16cid:durableId="114104297">
-    <w:abstractNumId w:val="1"/>
+    <w:abstractNumId w:val="2"/>
   </w:num>
   <w:num w:numId="14" w16cid:durableId="1513646882">
-    <w:abstractNumId w:val="1"/>
+    <w:abstractNumId w:val="2"/>
   </w:num>
   <w:num w:numId="15" w16cid:durableId="300814158">
-    <w:abstractNumId w:val="1"/>
+    <w:abstractNumId w:val="2"/>
   </w:num>
   <w:num w:numId="16" w16cid:durableId="134880882">
-    <w:abstractNumId w:val="1"/>
+    <w:abstractNumId w:val="2"/>
   </w:num>
   <w:num w:numId="17" w16cid:durableId="1770076880">
-    <w:abstractNumId w:val="1"/>
+    <w:abstractNumId w:val="2"/>
   </w:num>
   <w:num w:numId="18" w16cid:durableId="274486989">
-    <w:abstractNumId w:val="7"/>
+    <w:abstractNumId w:val="9"/>
     <w:lvlOverride w:ilvl="0">
       <w:startOverride w:val="1"/>
     </w:lvlOverride>
+  </w:num>
+  <w:num w:numId="19" w16cid:durableId="488404210">
+    <w:abstractNumId w:val="6"/>
+  </w:num>
+  <w:num w:numId="20" w16cid:durableId="1386561433">
+    <w:abstractNumId w:val="0"/>
   </w:num>
 </w:numbering>
 </file>
@@ -11918,6 +13013,40 @@
       <w:lang w:bidi="hi-IN"/>
     </w:rPr>
   </w:style>
+  <w:style w:type="table" w:styleId="Tabelacomgrade">
+    <w:name w:val="Table Grid"/>
+    <w:basedOn w:val="Tabelanormal"/>
+    <w:uiPriority w:val="59"/>
+    <w:rsid w:val="00462C81"/>
+    <w:pPr>
+      <w:spacing w:after="0" w:line="240" w:lineRule="auto"/>
+    </w:pPr>
+    <w:tblPr>
+      <w:tblBorders>
+        <w:top w:val="single" w:sz="4" w:space="0" w:color="auto"/>
+        <w:left w:val="single" w:sz="4" w:space="0" w:color="auto"/>
+        <w:bottom w:val="single" w:sz="4" w:space="0" w:color="auto"/>
+        <w:right w:val="single" w:sz="4" w:space="0" w:color="auto"/>
+        <w:insideH w:val="single" w:sz="4" w:space="0" w:color="auto"/>
+        <w:insideV w:val="single" w:sz="4" w:space="0" w:color="auto"/>
+      </w:tblBorders>
+    </w:tblPr>
+  </w:style>
+  <w:style w:type="paragraph" w:styleId="NormalWeb">
+    <w:name w:val="Normal (Web)"/>
+    <w:basedOn w:val="Normal"/>
+    <w:uiPriority w:val="99"/>
+    <w:semiHidden/>
+    <w:unhideWhenUsed/>
+    <w:rsid w:val="00C2565D"/>
+    <w:pPr>
+      <w:spacing w:before="100" w:beforeAutospacing="1" w:after="100" w:afterAutospacing="1"/>
+    </w:pPr>
+    <w:rPr>
+      <w:rFonts w:eastAsia="Times New Roman"/>
+      <w:lang w:eastAsia="pt-BR"/>
+    </w:rPr>
+  </w:style>
 </w:styles>
 </file>
 

</xml_diff>

<commit_message>
Update Documento de Arquitetura.docx; remove temp
Replace Documento de Arquitetura.docx with an updated binary version and delete the temporary Office lock file (~$cumento de Arquitetura.docx). Cleans up an accidental temp file and retains the updated architecture document.
</commit_message>
<xml_diff>
--- a/Documento de Arquitetura.docx
+++ b/Documento de Arquitetura.docx
@@ -6907,8 +6907,18 @@
         </w:numPr>
         <w:spacing w:before="40" w:after="40" w:line="240" w:lineRule="auto"/>
         <w:contextualSpacing w:val="0"/>
-      </w:pPr>
-      <w:r>
+        <w:rPr>
+          <w:rFonts w:ascii="Arial" w:hAnsi="Arial" w:cs="Arial"/>
+          <w:sz w:val="20"/>
+          <w:szCs w:val="20"/>
+        </w:rPr>
+      </w:pPr>
+      <w:r>
+        <w:rPr>
+          <w:rFonts w:ascii="Arial" w:hAnsi="Arial" w:cs="Arial"/>
+          <w:sz w:val="20"/>
+          <w:szCs w:val="20"/>
+        </w:rPr>
         <w:t>UC01 – Cadastro e Autenticação de Usuários</w:t>
       </w:r>
     </w:p>
@@ -6921,8 +6931,18 @@
         </w:numPr>
         <w:spacing w:before="40" w:after="40" w:line="240" w:lineRule="auto"/>
         <w:contextualSpacing w:val="0"/>
-      </w:pPr>
-      <w:r>
+        <w:rPr>
+          <w:rFonts w:ascii="Arial" w:hAnsi="Arial" w:cs="Arial"/>
+          <w:sz w:val="20"/>
+          <w:szCs w:val="20"/>
+        </w:rPr>
+      </w:pPr>
+      <w:r>
+        <w:rPr>
+          <w:rFonts w:ascii="Arial" w:hAnsi="Arial" w:cs="Arial"/>
+          <w:sz w:val="20"/>
+          <w:szCs w:val="20"/>
+        </w:rPr>
         <w:t>UC02 – Cadastro de Serviços pelo Freelancer</w:t>
       </w:r>
     </w:p>
@@ -6935,8 +6955,18 @@
         </w:numPr>
         <w:spacing w:before="40" w:after="40" w:line="240" w:lineRule="auto"/>
         <w:contextualSpacing w:val="0"/>
-      </w:pPr>
-      <w:r>
+        <w:rPr>
+          <w:rFonts w:ascii="Arial" w:hAnsi="Arial" w:cs="Arial"/>
+          <w:sz w:val="20"/>
+          <w:szCs w:val="20"/>
+        </w:rPr>
+      </w:pPr>
+      <w:r>
+        <w:rPr>
+          <w:rFonts w:ascii="Arial" w:hAnsi="Arial" w:cs="Arial"/>
+          <w:sz w:val="20"/>
+          <w:szCs w:val="20"/>
+        </w:rPr>
         <w:t>UC03 – Busca e Contratação de Serviços</w:t>
       </w:r>
     </w:p>
@@ -6949,8 +6979,18 @@
         </w:numPr>
         <w:spacing w:before="40" w:after="40" w:line="240" w:lineRule="auto"/>
         <w:contextualSpacing w:val="0"/>
-      </w:pPr>
-      <w:r>
+        <w:rPr>
+          <w:rFonts w:ascii="Arial" w:hAnsi="Arial" w:cs="Arial"/>
+          <w:sz w:val="20"/>
+          <w:szCs w:val="20"/>
+        </w:rPr>
+      </w:pPr>
+      <w:r>
+        <w:rPr>
+          <w:rFonts w:ascii="Arial" w:hAnsi="Arial" w:cs="Arial"/>
+          <w:sz w:val="20"/>
+          <w:szCs w:val="20"/>
+        </w:rPr>
         <w:t>UC04 – Avaliação de Serviços</w:t>
       </w:r>
     </w:p>
@@ -6963,9 +7003,67 @@
         </w:numPr>
         <w:spacing w:before="40" w:after="40" w:line="240" w:lineRule="auto"/>
         <w:contextualSpacing w:val="0"/>
-      </w:pPr>
-      <w:r>
+        <w:rPr>
+          <w:rFonts w:ascii="Arial" w:hAnsi="Arial" w:cs="Arial"/>
+          <w:sz w:val="20"/>
+          <w:szCs w:val="20"/>
+        </w:rPr>
+      </w:pPr>
+      <w:r>
+        <w:rPr>
+          <w:rFonts w:ascii="Arial" w:hAnsi="Arial" w:cs="Arial"/>
+          <w:sz w:val="20"/>
+          <w:szCs w:val="20"/>
+        </w:rPr>
         <w:t>UC05 – Painel Administrativo</w:t>
+      </w:r>
+    </w:p>
+    <w:p>
+      <w:pPr>
+        <w:pStyle w:val="PargrafodaLista"/>
+        <w:numPr>
+          <w:ilvl w:val="0"/>
+          <w:numId w:val="18"/>
+        </w:numPr>
+        <w:spacing w:before="40" w:after="40" w:line="240" w:lineRule="auto"/>
+        <w:contextualSpacing w:val="0"/>
+        <w:rPr>
+          <w:rFonts w:ascii="Arial" w:hAnsi="Arial" w:cs="Arial"/>
+          <w:sz w:val="20"/>
+          <w:szCs w:val="20"/>
+        </w:rPr>
+      </w:pPr>
+      <w:r>
+        <w:rPr>
+          <w:rFonts w:ascii="Arial" w:hAnsi="Arial" w:cs="Arial"/>
+          <w:sz w:val="20"/>
+          <w:szCs w:val="20"/>
+        </w:rPr>
+        <w:t>UC06</w:t>
+      </w:r>
+      <w:r>
+        <w:rPr>
+          <w:rFonts w:ascii="Arial" w:hAnsi="Arial" w:cs="Arial"/>
+          <w:sz w:val="20"/>
+          <w:szCs w:val="20"/>
+        </w:rPr>
+        <w:t xml:space="preserve"> –</w:t>
+      </w:r>
+      <w:r>
+        <w:rPr>
+          <w:rFonts w:ascii="Arial" w:hAnsi="Arial" w:cs="Arial"/>
+          <w:sz w:val="20"/>
+          <w:szCs w:val="20"/>
+        </w:rPr>
+        <w:t xml:space="preserve"> </w:t>
+      </w:r>
+      <w:r>
+        <w:rPr>
+          <w:rFonts w:ascii="Arial" w:hAnsi="Arial" w:cs="Arial"/>
+          <w:sz w:val="20"/>
+          <w:szCs w:val="20"/>
+        </w:rPr>
+        <w:t>Conclusão de Serviço</w:t>
       </w:r>
     </w:p>
     <w:p>
@@ -13043,7 +13141,6 @@
   <w:style w:type="character" w:default="1" w:styleId="Fontepargpadro">
     <w:name w:val="Default Paragraph Font"/>
     <w:uiPriority w:val="1"/>
-    <w:semiHidden/>
     <w:unhideWhenUsed/>
   </w:style>
   <w:style w:type="table" w:default="1" w:styleId="Tabelanormal">

</xml_diff>